<commit_message>
Aggiornato il testo del problema
</commit_message>
<xml_diff>
--- a/maranza/Maranza.docx
+++ b/maranza/Maranza.docx
@@ -11,7 +11,6 @@
           <w:bCs/>
           <w:sz w:val="44"/>
           <w:szCs w:val="44"/>
-          <w:lang w:val="en-US"/>
         </w:rPr>
       </w:pPr>
       <w:r>
@@ -87,14 +86,12 @@
       <w:r>
         <w:rPr>
           <w:rFonts w:ascii="Cascadia Code" w:hAnsi="Cascadia Code" w:cs="Cascadia Code"/>
-          <w:lang w:val="en-US"/>
         </w:rPr>
         <w:t xml:space="preserve">         </w:t>
       </w:r>
       <w:r>
         <w:rPr>
           <w:rFonts w:ascii="Cascadia Code" w:hAnsi="Cascadia Code" w:cs="Cascadia Code"/>
-          <w:lang w:val="en-US"/>
         </w:rPr>
         <w:t xml:space="preserve"> </w:t>
       </w:r>
@@ -105,7 +102,6 @@
           <w:bCs/>
           <w:sz w:val="44"/>
           <w:szCs w:val="44"/>
-          <w:lang w:val="en-US"/>
         </w:rPr>
         <w:t>Magi</w:t>
       </w:r>
@@ -116,7 +112,6 @@
           <w:bCs/>
           <w:sz w:val="44"/>
           <w:szCs w:val="44"/>
-          <w:lang w:val="en-US"/>
         </w:rPr>
         <w:t>CP</w:t>
       </w:r>
@@ -127,7 +122,6 @@
           <w:bCs/>
           <w:sz w:val="44"/>
           <w:szCs w:val="44"/>
-          <w:lang w:val="en-US"/>
         </w:rPr>
         <w:t xml:space="preserve"> 2026 – Training Problems</w:t>
       </w:r>
@@ -135,9 +129,6 @@
     <w:p>
       <w:pPr>
         <w:pStyle w:val="Intestazione"/>
-        <w:rPr>
-          <w:lang w:val="en-US"/>
-        </w:rPr>
       </w:pPr>
       <w:r>
         <w:rPr>
@@ -226,13 +217,11 @@
           <w:rFonts w:ascii="Cascadia Code" w:hAnsi="Cascadia Code" w:cs="Cascadia Code"/>
           <w:sz w:val="8"/>
           <w:szCs w:val="8"/>
-          <w:lang w:val="en-US"/>
         </w:rPr>
       </w:pPr>
       <w:r>
         <w:rPr>
           <w:rFonts w:ascii="Cascadia Code" w:hAnsi="Cascadia Code" w:cs="Cascadia Code"/>
-          <w:lang w:val="en-US"/>
         </w:rPr>
         <w:t xml:space="preserve">                           </w:t>
       </w:r>
@@ -247,7 +236,6 @@
       <w:r>
         <w:rPr>
           <w:rFonts w:ascii="Cascadia Code" w:hAnsi="Cascadia Code" w:cs="Cascadia Code"/>
-          <w:lang w:val="en-US"/>
         </w:rPr>
         <w:t xml:space="preserve">          </w:t>
       </w:r>
@@ -930,7 +918,6 @@
           <w:b/>
           <w:bCs/>
           <w:color w:val="000000" w:themeColor="text1"/>
-          <w:lang w:val="en-US"/>
         </w:rPr>
       </w:pPr>
       <w:r>
@@ -939,7 +926,6 @@
           <w:b/>
           <w:bCs/>
           <w:color w:val="000000" w:themeColor="text1"/>
-          <w:lang w:val="en-US"/>
         </w:rPr>
         <w:t>Output</w:t>
       </w:r>
@@ -1052,7 +1038,7 @@
           <w:numId w:val="1"/>
         </w:numPr>
         <w:rPr>
-          <w:rFonts w:ascii="Tenorite" w:hAnsi="Tenorite"/>
+          <w:rFonts w:ascii="Tenorite" w:eastAsiaTheme="minorEastAsia" w:hAnsi="Tenorite"/>
         </w:rPr>
       </w:pPr>
       <m:oMath>
@@ -1060,40 +1046,7 @@
           <w:rPr>
             <w:rFonts w:ascii="Cambria Math" w:hAnsi="Cambria Math"/>
           </w:rPr>
-          <m:t xml:space="preserve">T </m:t>
-        </m:r>
-        <m:r>
-          <w:rPr>
-            <w:rFonts w:ascii="Cambria Math" w:hAnsi="Cambria Math"/>
-            <w:lang w:val="en-US"/>
-          </w:rPr>
-          <m:t>= 10</m:t>
-        </m:r>
-      </m:oMath>
-    </w:p>
-    <w:p>
-      <w:pPr>
-        <w:pStyle w:val="Paragrafoelenco"/>
-        <w:numPr>
-          <w:ilvl w:val="0"/>
-          <w:numId w:val="1"/>
-        </w:numPr>
-        <w:rPr>
-          <w:rFonts w:ascii="Tenorite" w:eastAsiaTheme="minorEastAsia" w:hAnsi="Tenorite"/>
-        </w:rPr>
-      </w:pPr>
-      <m:oMath>
-        <m:r>
-          <w:rPr>
-            <w:rFonts w:ascii="Cambria Math" w:hAnsi="Cambria Math"/>
-          </w:rPr>
-          <m:t>1≤</m:t>
-        </m:r>
-        <m:r>
-          <w:rPr>
-            <w:rFonts w:ascii="Cambria Math" w:hAnsi="Cambria Math"/>
-          </w:rPr>
-          <m:t>N≤</m:t>
+          <m:t>1≤N≤</m:t>
         </m:r>
         <m:sSup>
           <m:sSupPr>
@@ -1139,13 +1092,7 @@
           <w:rPr>
             <w:rFonts w:ascii="Cambria Math" w:eastAsiaTheme="minorEastAsia" w:hAnsi="Cambria Math"/>
           </w:rPr>
-          <m:t>0≤K</m:t>
-        </m:r>
-        <m:r>
-          <w:rPr>
-            <w:rFonts w:ascii="Cambria Math" w:eastAsiaTheme="minorEastAsia" w:hAnsi="Cambria Math"/>
-          </w:rPr>
-          <m:t xml:space="preserve">,  </m:t>
+          <m:t xml:space="preserve">0≤K,  </m:t>
         </m:r>
         <m:sSub>
           <m:sSubPr>
@@ -1399,14 +1346,7 @@
             <w:rFonts w:ascii="Cambria Math" w:hAnsi="Cambria Math"/>
             <w:lang w:val="en-US"/>
           </w:rPr>
-          <m:t>N≤1</m:t>
-        </m:r>
-        <m:r>
-          <w:rPr>
-            <w:rFonts w:ascii="Cambria Math" w:hAnsi="Cambria Math"/>
-            <w:lang w:val="en-US"/>
-          </w:rPr>
-          <m:t>000</m:t>
+          <m:t>N≤1000</m:t>
         </m:r>
       </m:oMath>
     </w:p>

</xml_diff>